<commit_message>
mejora en la robustes del logs, nuevos campos postgres y mejora en README.docx y README.md
</commit_message>
<xml_diff>
--- a/README.docx
+++ b/README.docx
@@ -855,7 +855,7 @@
           <w:r>
             <w:fldChar w:fldCharType="separate"/>
           </w:r>
-          <w:hyperlink w:anchor="_Toc226313548" w:history="1">
+          <w:hyperlink w:anchor="_Toc226547263" w:history="1">
             <w:r>
               <w:rPr>
                 <w:rStyle w:val="Hipervnculo"/>
@@ -883,7 +883,7 @@
                 <w:noProof/>
                 <w:webHidden/>
               </w:rPr>
-              <w:instrText xml:space="preserve"> PAGEREF _Toc226313548 \h </w:instrText>
+              <w:instrText xml:space="preserve"> PAGEREF _Toc226547263 \h </w:instrText>
             </w:r>
             <w:r>
               <w:rPr>
@@ -930,7 +930,7 @@
               <w14:ligatures w14:val="standardContextual"/>
             </w:rPr>
           </w:pPr>
-          <w:hyperlink w:anchor="_Toc226313549" w:history="1">
+          <w:hyperlink w:anchor="_Toc226547264" w:history="1">
             <w:r>
               <w:rPr>
                 <w:rStyle w:val="Hipervnculo"/>
@@ -958,7 +958,7 @@
                 <w:noProof/>
                 <w:webHidden/>
               </w:rPr>
-              <w:instrText xml:space="preserve"> PAGEREF _Toc226313549 \h </w:instrText>
+              <w:instrText xml:space="preserve"> PAGEREF _Toc226547264 \h </w:instrText>
             </w:r>
             <w:r>
               <w:rPr>
@@ -1005,7 +1005,7 @@
               <w14:ligatures w14:val="standardContextual"/>
             </w:rPr>
           </w:pPr>
-          <w:hyperlink w:anchor="_Toc226313550" w:history="1">
+          <w:hyperlink w:anchor="_Toc226547265" w:history="1">
             <w:r>
               <w:rPr>
                 <w:rStyle w:val="Hipervnculo"/>
@@ -1043,7 +1043,7 @@
                 <w:noProof/>
                 <w:webHidden/>
               </w:rPr>
-              <w:instrText xml:space="preserve"> PAGEREF _Toc226313550 \h </w:instrText>
+              <w:instrText xml:space="preserve"> PAGEREF _Toc226547265 \h </w:instrText>
             </w:r>
             <w:r>
               <w:rPr>
@@ -1090,7 +1090,7 @@
               <w14:ligatures w14:val="standardContextual"/>
             </w:rPr>
           </w:pPr>
-          <w:hyperlink w:anchor="_Toc226313551" w:history="1">
+          <w:hyperlink w:anchor="_Toc226547266" w:history="1">
             <w:r>
               <w:rPr>
                 <w:rStyle w:val="Hipervnculo"/>
@@ -1118,7 +1118,7 @@
                 <w:noProof/>
                 <w:webHidden/>
               </w:rPr>
-              <w:instrText xml:space="preserve"> PAGEREF _Toc226313551 \h </w:instrText>
+              <w:instrText xml:space="preserve"> PAGEREF _Toc226547266 \h </w:instrText>
             </w:r>
             <w:r>
               <w:rPr>
@@ -1165,7 +1165,7 @@
               <w14:ligatures w14:val="standardContextual"/>
             </w:rPr>
           </w:pPr>
-          <w:hyperlink w:anchor="_Toc226313552" w:history="1">
+          <w:hyperlink w:anchor="_Toc226547267" w:history="1">
             <w:r>
               <w:rPr>
                 <w:rStyle w:val="Hipervnculo"/>
@@ -1193,7 +1193,7 @@
                 <w:noProof/>
                 <w:webHidden/>
               </w:rPr>
-              <w:instrText xml:space="preserve"> PAGEREF _Toc226313552 \h </w:instrText>
+              <w:instrText xml:space="preserve"> PAGEREF _Toc226547267 \h </w:instrText>
             </w:r>
             <w:r>
               <w:rPr>
@@ -1240,7 +1240,7 @@
               <w14:ligatures w14:val="standardContextual"/>
             </w:rPr>
           </w:pPr>
-          <w:hyperlink w:anchor="_Toc226313553" w:history="1">
+          <w:hyperlink w:anchor="_Toc226547268" w:history="1">
             <w:r>
               <w:rPr>
                 <w:rStyle w:val="Hipervnculo"/>
@@ -1268,7 +1268,7 @@
                 <w:noProof/>
                 <w:webHidden/>
               </w:rPr>
-              <w:instrText xml:space="preserve"> PAGEREF _Toc226313553 \h </w:instrText>
+              <w:instrText xml:space="preserve"> PAGEREF _Toc226547268 \h </w:instrText>
             </w:r>
             <w:r>
               <w:rPr>
@@ -1315,7 +1315,7 @@
               <w14:ligatures w14:val="standardContextual"/>
             </w:rPr>
           </w:pPr>
-          <w:hyperlink w:anchor="_Toc226313554" w:history="1">
+          <w:hyperlink w:anchor="_Toc226547269" w:history="1">
             <w:r>
               <w:rPr>
                 <w:rStyle w:val="Hipervnculo"/>
@@ -1343,7 +1343,7 @@
                 <w:noProof/>
                 <w:webHidden/>
               </w:rPr>
-              <w:instrText xml:space="preserve"> PAGEREF _Toc226313554 \h </w:instrText>
+              <w:instrText xml:space="preserve"> PAGEREF _Toc226547269 \h </w:instrText>
             </w:r>
             <w:r>
               <w:rPr>
@@ -1390,7 +1390,7 @@
               <w14:ligatures w14:val="standardContextual"/>
             </w:rPr>
           </w:pPr>
-          <w:hyperlink w:anchor="_Toc226313555" w:history="1">
+          <w:hyperlink w:anchor="_Toc226547270" w:history="1">
             <w:r>
               <w:rPr>
                 <w:rStyle w:val="Hipervnculo"/>
@@ -1418,7 +1418,7 @@
                 <w:noProof/>
                 <w:webHidden/>
               </w:rPr>
-              <w:instrText xml:space="preserve"> PAGEREF _Toc226313555 \h </w:instrText>
+              <w:instrText xml:space="preserve"> PAGEREF _Toc226547270 \h </w:instrText>
             </w:r>
             <w:r>
               <w:rPr>
@@ -1465,7 +1465,7 @@
               <w14:ligatures w14:val="standardContextual"/>
             </w:rPr>
           </w:pPr>
-          <w:hyperlink w:anchor="_Toc226313556" w:history="1">
+          <w:hyperlink w:anchor="_Toc226547271" w:history="1">
             <w:r>
               <w:rPr>
                 <w:rStyle w:val="Hipervnculo"/>
@@ -1493,7 +1493,7 @@
                 <w:noProof/>
                 <w:webHidden/>
               </w:rPr>
-              <w:instrText xml:space="preserve"> PAGEREF _Toc226313556 \h </w:instrText>
+              <w:instrText xml:space="preserve"> PAGEREF _Toc226547271 \h </w:instrText>
             </w:r>
             <w:r>
               <w:rPr>
@@ -1540,7 +1540,7 @@
               <w14:ligatures w14:val="standardContextual"/>
             </w:rPr>
           </w:pPr>
-          <w:hyperlink w:anchor="_Toc226313557" w:history="1">
+          <w:hyperlink w:anchor="_Toc226547272" w:history="1">
             <w:r>
               <w:rPr>
                 <w:rStyle w:val="Hipervnculo"/>
@@ -1568,7 +1568,7 @@
                 <w:noProof/>
                 <w:webHidden/>
               </w:rPr>
-              <w:instrText xml:space="preserve"> PAGEREF _Toc226313557 \h </w:instrText>
+              <w:instrText xml:space="preserve"> PAGEREF _Toc226547272 \h </w:instrText>
             </w:r>
             <w:r>
               <w:rPr>
@@ -1615,7 +1615,7 @@
               <w14:ligatures w14:val="standardContextual"/>
             </w:rPr>
           </w:pPr>
-          <w:hyperlink w:anchor="_Toc226313558" w:history="1">
+          <w:hyperlink w:anchor="_Toc226547273" w:history="1">
             <w:r>
               <w:rPr>
                 <w:rStyle w:val="Hipervnculo"/>
@@ -1643,7 +1643,7 @@
                 <w:noProof/>
                 <w:webHidden/>
               </w:rPr>
-              <w:instrText xml:space="preserve"> PAGEREF _Toc226313558 \h </w:instrText>
+              <w:instrText xml:space="preserve"> PAGEREF _Toc226547273 \h </w:instrText>
             </w:r>
             <w:r>
               <w:rPr>
@@ -1690,7 +1690,7 @@
               <w14:ligatures w14:val="standardContextual"/>
             </w:rPr>
           </w:pPr>
-          <w:hyperlink w:anchor="_Toc226313559" w:history="1">
+          <w:hyperlink w:anchor="_Toc226547274" w:history="1">
             <w:r>
               <w:rPr>
                 <w:rStyle w:val="Hipervnculo"/>
@@ -1718,7 +1718,7 @@
                 <w:noProof/>
                 <w:webHidden/>
               </w:rPr>
-              <w:instrText xml:space="preserve"> PAGEREF _Toc226313559 \h </w:instrText>
+              <w:instrText xml:space="preserve"> PAGEREF _Toc226547274 \h </w:instrText>
             </w:r>
             <w:r>
               <w:rPr>
@@ -1765,14 +1765,14 @@
               <w14:ligatures w14:val="standardContextual"/>
             </w:rPr>
           </w:pPr>
-          <w:hyperlink w:anchor="_Toc226313560" w:history="1">
+          <w:hyperlink w:anchor="_Toc226547275" w:history="1">
             <w:r>
               <w:rPr>
                 <w:rStyle w:val="Hipervnculo"/>
                 <w:rFonts w:ascii="Arial Rounded MT Bold" w:hAnsi="Arial Rounded MT Bold"/>
                 <w:noProof/>
               </w:rPr>
-              <w:t>Crear la tabla de logs en PostgreSQL</w:t>
+              <w:t>Ingreso al a base de datos a través de la consola de Docker o en su defecto poweeshelltablas</w:t>
             </w:r>
             <w:r>
               <w:rPr>
@@ -1793,7 +1793,7 @@
                 <w:noProof/>
                 <w:webHidden/>
               </w:rPr>
-              <w:instrText xml:space="preserve"> PAGEREF _Toc226313560 \h </w:instrText>
+              <w:instrText xml:space="preserve"> PAGEREF _Toc226547275 \h </w:instrText>
             </w:r>
             <w:r>
               <w:rPr>
@@ -1840,14 +1840,14 @@
               <w14:ligatures w14:val="standardContextual"/>
             </w:rPr>
           </w:pPr>
-          <w:hyperlink w:anchor="_Toc226313561" w:history="1">
+          <w:hyperlink w:anchor="_Toc226547276" w:history="1">
             <w:r>
               <w:rPr>
                 <w:rStyle w:val="Hipervnculo"/>
                 <w:rFonts w:ascii="Arial Rounded MT Bold" w:hAnsi="Arial Rounded MT Bold"/>
                 <w:noProof/>
               </w:rPr>
-              <w:t>Importar el flujo en n8n</w:t>
+              <w:t>ver tablas</w:t>
             </w:r>
             <w:r>
               <w:rPr>
@@ -1868,7 +1868,7 @@
                 <w:noProof/>
                 <w:webHidden/>
               </w:rPr>
-              <w:instrText xml:space="preserve"> PAGEREF _Toc226313561 \h </w:instrText>
+              <w:instrText xml:space="preserve"> PAGEREF _Toc226547276 \h </w:instrText>
             </w:r>
             <w:r>
               <w:rPr>
@@ -1915,14 +1915,14 @@
               <w14:ligatures w14:val="standardContextual"/>
             </w:rPr>
           </w:pPr>
-          <w:hyperlink w:anchor="_Toc226313562" w:history="1">
+          <w:hyperlink w:anchor="_Toc226547277" w:history="1">
             <w:r>
               <w:rPr>
                 <w:rStyle w:val="Hipervnculo"/>
                 <w:rFonts w:ascii="Arial Rounded MT Bold" w:hAnsi="Arial Rounded MT Bold"/>
                 <w:noProof/>
               </w:rPr>
-              <w:t>Formato del correo disparador</w:t>
+              <w:t>Crear la tabla de logs en PostgreSQL</w:t>
             </w:r>
             <w:r>
               <w:rPr>
@@ -1943,7 +1943,7 @@
                 <w:noProof/>
                 <w:webHidden/>
               </w:rPr>
-              <w:instrText xml:space="preserve"> PAGEREF _Toc226313562 \h </w:instrText>
+              <w:instrText xml:space="preserve"> PAGEREF _Toc226547277 \h </w:instrText>
             </w:r>
             <w:r>
               <w:rPr>
@@ -1990,7 +1990,232 @@
               <w14:ligatures w14:val="standardContextual"/>
             </w:rPr>
           </w:pPr>
-          <w:hyperlink w:anchor="_Toc226313563" w:history="1">
+          <w:hyperlink w:anchor="_Toc226547278" w:history="1">
+            <w:r>
+              <w:rPr>
+                <w:rStyle w:val="Hipervnculo"/>
+                <w:rFonts w:ascii="Arial Rounded MT Bold" w:hAnsi="Arial Rounded MT Bold"/>
+                <w:noProof/>
+              </w:rPr>
+              <w:t>Crear la tabla de logs en PostgreSQL</w:t>
+            </w:r>
+            <w:r>
+              <w:rPr>
+                <w:noProof/>
+                <w:webHidden/>
+              </w:rPr>
+              <w:tab/>
+            </w:r>
+            <w:r>
+              <w:rPr>
+                <w:noProof/>
+                <w:webHidden/>
+              </w:rPr>
+              <w:fldChar w:fldCharType="begin"/>
+            </w:r>
+            <w:r>
+              <w:rPr>
+                <w:noProof/>
+                <w:webHidden/>
+              </w:rPr>
+              <w:instrText xml:space="preserve"> PAGEREF _Toc226547278 \h </w:instrText>
+            </w:r>
+            <w:r>
+              <w:rPr>
+                <w:noProof/>
+                <w:webHidden/>
+              </w:rPr>
+            </w:r>
+            <w:r>
+              <w:rPr>
+                <w:noProof/>
+                <w:webHidden/>
+              </w:rPr>
+              <w:fldChar w:fldCharType="separate"/>
+            </w:r>
+            <w:r>
+              <w:rPr>
+                <w:noProof/>
+                <w:webHidden/>
+              </w:rPr>
+              <w:t>7</w:t>
+            </w:r>
+            <w:r>
+              <w:rPr>
+                <w:noProof/>
+                <w:webHidden/>
+              </w:rPr>
+              <w:fldChar w:fldCharType="end"/>
+            </w:r>
+          </w:hyperlink>
+        </w:p>
+        <w:p>
+          <w:pPr>
+            <w:pStyle w:val="TDC2"/>
+            <w:tabs>
+              <w:tab w:val="right" w:leader="dot" w:pos="8828"/>
+            </w:tabs>
+            <w:rPr>
+              <w:rFonts w:eastAsiaTheme="minorEastAsia"/>
+              <w:noProof/>
+              <w:kern w:val="2"/>
+              <w:sz w:val="24"/>
+              <w:szCs w:val="24"/>
+              <w:lang w:eastAsia="es-CO"/>
+              <w14:ligatures w14:val="standardContextual"/>
+            </w:rPr>
+          </w:pPr>
+          <w:hyperlink w:anchor="_Toc226547279" w:history="1">
+            <w:r>
+              <w:rPr>
+                <w:rStyle w:val="Hipervnculo"/>
+                <w:rFonts w:ascii="Arial Rounded MT Bold" w:hAnsi="Arial Rounded MT Bold"/>
+                <w:noProof/>
+              </w:rPr>
+              <w:t>Importar el flujo en n8n</w:t>
+            </w:r>
+            <w:r>
+              <w:rPr>
+                <w:noProof/>
+                <w:webHidden/>
+              </w:rPr>
+              <w:tab/>
+            </w:r>
+            <w:r>
+              <w:rPr>
+                <w:noProof/>
+                <w:webHidden/>
+              </w:rPr>
+              <w:fldChar w:fldCharType="begin"/>
+            </w:r>
+            <w:r>
+              <w:rPr>
+                <w:noProof/>
+                <w:webHidden/>
+              </w:rPr>
+              <w:instrText xml:space="preserve"> PAGEREF _Toc226547279 \h </w:instrText>
+            </w:r>
+            <w:r>
+              <w:rPr>
+                <w:noProof/>
+                <w:webHidden/>
+              </w:rPr>
+            </w:r>
+            <w:r>
+              <w:rPr>
+                <w:noProof/>
+                <w:webHidden/>
+              </w:rPr>
+              <w:fldChar w:fldCharType="separate"/>
+            </w:r>
+            <w:r>
+              <w:rPr>
+                <w:noProof/>
+                <w:webHidden/>
+              </w:rPr>
+              <w:t>8</w:t>
+            </w:r>
+            <w:r>
+              <w:rPr>
+                <w:noProof/>
+                <w:webHidden/>
+              </w:rPr>
+              <w:fldChar w:fldCharType="end"/>
+            </w:r>
+          </w:hyperlink>
+        </w:p>
+        <w:p>
+          <w:pPr>
+            <w:pStyle w:val="TDC2"/>
+            <w:tabs>
+              <w:tab w:val="right" w:leader="dot" w:pos="8828"/>
+            </w:tabs>
+            <w:rPr>
+              <w:rFonts w:eastAsiaTheme="minorEastAsia"/>
+              <w:noProof/>
+              <w:kern w:val="2"/>
+              <w:sz w:val="24"/>
+              <w:szCs w:val="24"/>
+              <w:lang w:eastAsia="es-CO"/>
+              <w14:ligatures w14:val="standardContextual"/>
+            </w:rPr>
+          </w:pPr>
+          <w:hyperlink w:anchor="_Toc226547280" w:history="1">
+            <w:r>
+              <w:rPr>
+                <w:rStyle w:val="Hipervnculo"/>
+                <w:rFonts w:ascii="Arial Rounded MT Bold" w:hAnsi="Arial Rounded MT Bold"/>
+                <w:noProof/>
+              </w:rPr>
+              <w:t>Formato del correo disparador</w:t>
+            </w:r>
+            <w:r>
+              <w:rPr>
+                <w:noProof/>
+                <w:webHidden/>
+              </w:rPr>
+              <w:tab/>
+            </w:r>
+            <w:r>
+              <w:rPr>
+                <w:noProof/>
+                <w:webHidden/>
+              </w:rPr>
+              <w:fldChar w:fldCharType="begin"/>
+            </w:r>
+            <w:r>
+              <w:rPr>
+                <w:noProof/>
+                <w:webHidden/>
+              </w:rPr>
+              <w:instrText xml:space="preserve"> PAGEREF _Toc226547280 \h </w:instrText>
+            </w:r>
+            <w:r>
+              <w:rPr>
+                <w:noProof/>
+                <w:webHidden/>
+              </w:rPr>
+            </w:r>
+            <w:r>
+              <w:rPr>
+                <w:noProof/>
+                <w:webHidden/>
+              </w:rPr>
+              <w:fldChar w:fldCharType="separate"/>
+            </w:r>
+            <w:r>
+              <w:rPr>
+                <w:noProof/>
+                <w:webHidden/>
+              </w:rPr>
+              <w:t>8</w:t>
+            </w:r>
+            <w:r>
+              <w:rPr>
+                <w:noProof/>
+                <w:webHidden/>
+              </w:rPr>
+              <w:fldChar w:fldCharType="end"/>
+            </w:r>
+          </w:hyperlink>
+        </w:p>
+        <w:p>
+          <w:pPr>
+            <w:pStyle w:val="TDC2"/>
+            <w:tabs>
+              <w:tab w:val="right" w:leader="dot" w:pos="8828"/>
+            </w:tabs>
+            <w:rPr>
+              <w:rFonts w:eastAsiaTheme="minorEastAsia"/>
+              <w:noProof/>
+              <w:kern w:val="2"/>
+              <w:sz w:val="24"/>
+              <w:szCs w:val="24"/>
+              <w:lang w:eastAsia="es-CO"/>
+              <w14:ligatures w14:val="standardContextual"/>
+            </w:rPr>
+          </w:pPr>
+          <w:hyperlink w:anchor="_Toc226547281" w:history="1">
             <w:r>
               <w:rPr>
                 <w:rStyle w:val="Hipervnculo"/>
@@ -2018,7 +2243,7 @@
                 <w:noProof/>
                 <w:webHidden/>
               </w:rPr>
-              <w:instrText xml:space="preserve"> PAGEREF _Toc226313563 \h </w:instrText>
+              <w:instrText xml:space="preserve"> PAGEREF _Toc226547281 \h </w:instrText>
             </w:r>
             <w:r>
               <w:rPr>
@@ -2065,7 +2290,7 @@
               <w14:ligatures w14:val="standardContextual"/>
             </w:rPr>
           </w:pPr>
-          <w:hyperlink w:anchor="_Toc226313564" w:history="1">
+          <w:hyperlink w:anchor="_Toc226547282" w:history="1">
             <w:r>
               <w:rPr>
                 <w:rStyle w:val="Hipervnculo"/>
@@ -2093,7 +2318,7 @@
                 <w:noProof/>
                 <w:webHidden/>
               </w:rPr>
-              <w:instrText xml:space="preserve"> PAGEREF _Toc226313564 \h </w:instrText>
+              <w:instrText xml:space="preserve"> PAGEREF _Toc226547282 \h </w:instrText>
             </w:r>
             <w:r>
               <w:rPr>
@@ -2113,7 +2338,7 @@
                 <w:noProof/>
                 <w:webHidden/>
               </w:rPr>
-              <w:t>8</w:t>
+              <w:t>9</w:t>
             </w:r>
             <w:r>
               <w:rPr>
@@ -2140,7 +2365,7 @@
               <w14:ligatures w14:val="standardContextual"/>
             </w:rPr>
           </w:pPr>
-          <w:hyperlink w:anchor="_Toc226313565" w:history="1">
+          <w:hyperlink w:anchor="_Toc226547283" w:history="1">
             <w:r>
               <w:rPr>
                 <w:rStyle w:val="Hipervnculo"/>
@@ -2168,7 +2393,7 @@
                 <w:noProof/>
                 <w:webHidden/>
               </w:rPr>
-              <w:instrText xml:space="preserve"> PAGEREF _Toc226313565 \h </w:instrText>
+              <w:instrText xml:space="preserve"> PAGEREF _Toc226547283 \h </w:instrText>
             </w:r>
             <w:r>
               <w:rPr>
@@ -2188,7 +2413,7 @@
                 <w:noProof/>
                 <w:webHidden/>
               </w:rPr>
-              <w:t>8</w:t>
+              <w:t>9</w:t>
             </w:r>
             <w:r>
               <w:rPr>
@@ -2215,7 +2440,7 @@
               <w14:ligatures w14:val="standardContextual"/>
             </w:rPr>
           </w:pPr>
-          <w:hyperlink w:anchor="_Toc226313566" w:history="1">
+          <w:hyperlink w:anchor="_Toc226547284" w:history="1">
             <w:r>
               <w:rPr>
                 <w:rStyle w:val="Hipervnculo"/>
@@ -2243,7 +2468,7 @@
                 <w:noProof/>
                 <w:webHidden/>
               </w:rPr>
-              <w:instrText xml:space="preserve"> PAGEREF _Toc226313566 \h </w:instrText>
+              <w:instrText xml:space="preserve"> PAGEREF _Toc226547284 \h </w:instrText>
             </w:r>
             <w:r>
               <w:rPr>
@@ -2290,7 +2515,7 @@
               <w14:ligatures w14:val="standardContextual"/>
             </w:rPr>
           </w:pPr>
-          <w:hyperlink w:anchor="_Toc226313567" w:history="1">
+          <w:hyperlink w:anchor="_Toc226547285" w:history="1">
             <w:r>
               <w:rPr>
                 <w:rStyle w:val="Hipervnculo"/>
@@ -2318,7 +2543,7 @@
                 <w:noProof/>
                 <w:webHidden/>
               </w:rPr>
-              <w:instrText xml:space="preserve"> PAGEREF _Toc226313567 \h </w:instrText>
+              <w:instrText xml:space="preserve"> PAGEREF _Toc226547285 \h </w:instrText>
             </w:r>
             <w:r>
               <w:rPr>
@@ -2365,7 +2590,7 @@
               <w14:ligatures w14:val="standardContextual"/>
             </w:rPr>
           </w:pPr>
-          <w:hyperlink w:anchor="_Toc226313568" w:history="1">
+          <w:hyperlink w:anchor="_Toc226547286" w:history="1">
             <w:r>
               <w:rPr>
                 <w:rStyle w:val="Hipervnculo"/>
@@ -2409,7 +2634,7 @@
                 <w:noProof/>
                 <w:webHidden/>
               </w:rPr>
-              <w:instrText xml:space="preserve"> PAGEREF _Toc226313568 \h </w:instrText>
+              <w:instrText xml:space="preserve"> PAGEREF _Toc226547286 \h </w:instrText>
             </w:r>
             <w:r>
               <w:rPr>
@@ -2456,7 +2681,7 @@
               <w14:ligatures w14:val="standardContextual"/>
             </w:rPr>
           </w:pPr>
-          <w:hyperlink w:anchor="_Toc226313569" w:history="1">
+          <w:hyperlink w:anchor="_Toc226547287" w:history="1">
             <w:r>
               <w:rPr>
                 <w:rStyle w:val="Hipervnculo"/>
@@ -2484,7 +2709,7 @@
                 <w:noProof/>
                 <w:webHidden/>
               </w:rPr>
-              <w:instrText xml:space="preserve"> PAGEREF _Toc226313569 \h </w:instrText>
+              <w:instrText xml:space="preserve"> PAGEREF _Toc226547287 \h </w:instrText>
             </w:r>
             <w:r>
               <w:rPr>
@@ -2531,7 +2756,7 @@
               <w14:ligatures w14:val="standardContextual"/>
             </w:rPr>
           </w:pPr>
-          <w:hyperlink w:anchor="_Toc226313570" w:history="1">
+          <w:hyperlink w:anchor="_Toc226547288" w:history="1">
             <w:r>
               <w:rPr>
                 <w:rStyle w:val="Hipervnculo"/>
@@ -2559,7 +2784,7 @@
                 <w:noProof/>
                 <w:webHidden/>
               </w:rPr>
-              <w:instrText xml:space="preserve"> PAGEREF _Toc226313570 \h </w:instrText>
+              <w:instrText xml:space="preserve"> PAGEREF _Toc226547288 \h </w:instrText>
             </w:r>
             <w:r>
               <w:rPr>
@@ -2579,7 +2804,7 @@
                 <w:noProof/>
                 <w:webHidden/>
               </w:rPr>
-              <w:t>9</w:t>
+              <w:t>10</w:t>
             </w:r>
             <w:r>
               <w:rPr>
@@ -2606,7 +2831,7 @@
               <w14:ligatures w14:val="standardContextual"/>
             </w:rPr>
           </w:pPr>
-          <w:hyperlink w:anchor="_Toc226313571" w:history="1">
+          <w:hyperlink w:anchor="_Toc226547289" w:history="1">
             <w:r>
               <w:rPr>
                 <w:rStyle w:val="Hipervnculo"/>
@@ -2634,7 +2859,7 @@
                 <w:noProof/>
                 <w:webHidden/>
               </w:rPr>
-              <w:instrText xml:space="preserve"> PAGEREF _Toc226313571 \h </w:instrText>
+              <w:instrText xml:space="preserve"> PAGEREF _Toc226547289 \h </w:instrText>
             </w:r>
             <w:r>
               <w:rPr>
@@ -2690,7 +2915,7 @@
           <w:rFonts w:ascii="Arial Rounded MT Bold" w:hAnsi="Arial Rounded MT Bold"/>
         </w:rPr>
       </w:pPr>
-      <w:bookmarkStart w:id="0" w:name="_Toc226313548"/>
+      <w:bookmarkStart w:id="0" w:name="_Toc226547263"/>
       <w:r>
         <w:rPr>
           <w:rFonts w:ascii="Arial Rounded MT Bold" w:hAnsi="Arial Rounded MT Bold"/>
@@ -2714,7 +2939,7 @@
           <w:rFonts w:ascii="Arial Rounded MT Bold" w:hAnsi="Arial Rounded MT Bold"/>
         </w:rPr>
       </w:pPr>
-      <w:bookmarkStart w:id="1" w:name="_Toc226313549"/>
+      <w:bookmarkStart w:id="1" w:name="_Toc226547264"/>
       <w:r>
         <w:rPr>
           <w:rFonts w:ascii="Arial Rounded MT Bold" w:hAnsi="Arial Rounded MT Bold"/>
@@ -3187,7 +3412,7 @@
           <w:bCs/>
         </w:rPr>
       </w:pPr>
-      <w:bookmarkStart w:id="2" w:name="_Toc226313550"/>
+      <w:bookmarkStart w:id="2" w:name="_Toc226547265"/>
       <w:r>
         <w:rPr>
           <w:rFonts w:ascii="Arial Rounded MT Bold" w:eastAsia="Arial" w:hAnsi="Arial Rounded MT Bold"/>
@@ -3395,7 +3620,7 @@
           <w:rFonts w:ascii="Arial Rounded MT Bold" w:hAnsi="Arial Rounded MT Bold"/>
         </w:rPr>
       </w:pPr>
-      <w:bookmarkStart w:id="3" w:name="_Toc226313551"/>
+      <w:bookmarkStart w:id="3" w:name="_Toc226547266"/>
       <w:r>
         <w:rPr>
           <w:rFonts w:ascii="Arial Rounded MT Bold" w:hAnsi="Arial Rounded MT Bold"/>
@@ -3418,7 +3643,7 @@
           <w:rFonts w:ascii="Arial Rounded MT Bold" w:hAnsi="Arial Rounded MT Bold"/>
         </w:rPr>
       </w:pPr>
-      <w:bookmarkStart w:id="4" w:name="_Toc226313552"/>
+      <w:bookmarkStart w:id="4" w:name="_Toc226547267"/>
       <w:r>
         <w:rPr>
           <w:rFonts w:ascii="Arial Rounded MT Bold" w:hAnsi="Arial Rounded MT Bold"/>
@@ -3497,7 +3722,7 @@
           <w:rFonts w:ascii="Arial Rounded MT Bold" w:hAnsi="Arial Rounded MT Bold"/>
         </w:rPr>
       </w:pPr>
-      <w:bookmarkStart w:id="5" w:name="_Toc226313553"/>
+      <w:bookmarkStart w:id="5" w:name="_Toc226547268"/>
       <w:r>
         <w:rPr>
           <w:rFonts w:ascii="Arial Rounded MT Bold" w:hAnsi="Arial Rounded MT Bold"/>
@@ -3602,7 +3827,7 @@
           <w:rFonts w:ascii="Arial Rounded MT Bold" w:hAnsi="Arial Rounded MT Bold"/>
         </w:rPr>
       </w:pPr>
-      <w:bookmarkStart w:id="6" w:name="_Toc226313554"/>
+      <w:bookmarkStart w:id="6" w:name="_Toc226547269"/>
       <w:r>
         <w:rPr>
           <w:rFonts w:ascii="Arial Rounded MT Bold" w:hAnsi="Arial Rounded MT Bold"/>
@@ -3633,7 +3858,7 @@
           <w:rFonts w:ascii="Arial Rounded MT Bold" w:hAnsi="Arial Rounded MT Bold"/>
         </w:rPr>
       </w:pPr>
-      <w:bookmarkStart w:id="7" w:name="_Toc226313555"/>
+      <w:bookmarkStart w:id="7" w:name="_Toc226547270"/>
       <w:r>
         <w:rPr>
           <w:rFonts w:ascii="Arial Rounded MT Bold" w:hAnsi="Arial Rounded MT Bold"/>
@@ -3772,7 +3997,7 @@
           <w:rFonts w:ascii="Arial Rounded MT Bold" w:hAnsi="Arial Rounded MT Bold"/>
         </w:rPr>
       </w:pPr>
-      <w:bookmarkStart w:id="8" w:name="_Toc226313556"/>
+      <w:bookmarkStart w:id="8" w:name="_Toc226547271"/>
       <w:r>
         <w:rPr>
           <w:rFonts w:ascii="Arial Rounded MT Bold" w:hAnsi="Arial Rounded MT Bold"/>
@@ -4311,7 +4536,7 @@
           <w:rFonts w:ascii="Arial Rounded MT Bold" w:hAnsi="Arial Rounded MT Bold"/>
         </w:rPr>
       </w:pPr>
-      <w:bookmarkStart w:id="9" w:name="_Toc226313557"/>
+      <w:bookmarkStart w:id="9" w:name="_Toc226547272"/>
       <w:r>
         <w:rPr>
           <w:rFonts w:ascii="Arial Rounded MT Bold" w:hAnsi="Arial Rounded MT Bold"/>
@@ -4539,7 +4764,7 @@
           <w:rFonts w:ascii="Arial Rounded MT Bold" w:hAnsi="Arial Rounded MT Bold"/>
         </w:rPr>
       </w:pPr>
-      <w:bookmarkStart w:id="10" w:name="_Toc226313558"/>
+      <w:bookmarkStart w:id="10" w:name="_Toc226547273"/>
       <w:r>
         <w:rPr>
           <w:rFonts w:ascii="Arial Rounded MT Bold" w:hAnsi="Arial Rounded MT Bold"/>
@@ -4815,7 +5040,7 @@
           <w:rFonts w:ascii="Arial Rounded MT Bold" w:hAnsi="Arial Rounded MT Bold"/>
         </w:rPr>
       </w:pPr>
-      <w:bookmarkStart w:id="11" w:name="_Toc226313559"/>
+      <w:bookmarkStart w:id="11" w:name="_Toc226547274"/>
       <w:r>
         <w:rPr>
           <w:rFonts w:ascii="Arial Rounded MT Bold" w:hAnsi="Arial Rounded MT Bold"/>
@@ -4954,7 +5179,7 @@
           <w:lang w:val="en-US"/>
         </w:rPr>
         <w:drawing>
-          <wp:inline distT="0" distB="0" distL="0" distR="0" wp14:anchorId="398B27F7" wp14:editId="17D271B4">
+          <wp:inline distT="0" distB="0" distL="0" distR="0" wp14:anchorId="398B27F7" wp14:editId="10819597">
             <wp:extent cx="2306953" cy="3182112"/>
             <wp:effectExtent l="0" t="0" r="0" b="0"/>
             <wp:docPr id="303821705" name="Imagen 6"/>
@@ -5228,7 +5453,7 @@
           <w:lang w:val="en-US"/>
         </w:rPr>
         <w:drawing>
-          <wp:inline distT="0" distB="0" distL="0" distR="0" wp14:anchorId="1DEE093A" wp14:editId="7D5A99FD">
+          <wp:inline distT="0" distB="0" distL="0" distR="0" wp14:anchorId="1DEE093A" wp14:editId="742D7F82">
             <wp:extent cx="2311624" cy="3188554"/>
             <wp:effectExtent l="0" t="0" r="0" b="0"/>
             <wp:docPr id="629159415" name="Imagen 6"/>
@@ -5334,6 +5559,127 @@
           </wp:inline>
         </w:drawing>
       </w:r>
+      <w:r>
+        <w:rPr>
+          <w:rFonts w:asciiTheme="minorHAnsi" w:hAnsiTheme="minorHAnsi" w:cstheme="minorHAnsi"/>
+          <w:sz w:val="24"/>
+          <w:szCs w:val="24"/>
+          <w:lang w:val="en-US"/>
+        </w:rPr>
+        <w:br/>
+      </w:r>
+    </w:p>
+    <w:p>
+      <w:pPr>
+        <w:pStyle w:val="Ttulo2"/>
+        <w:rPr>
+          <w:rFonts w:ascii="Arial Rounded MT Bold" w:hAnsi="Arial Rounded MT Bold"/>
+          <w:u w:val="single"/>
+        </w:rPr>
+      </w:pPr>
+      <w:bookmarkStart w:id="12" w:name="_Toc226547275"/>
+      <w:r>
+        <w:rPr>
+          <w:rFonts w:ascii="Arial Rounded MT Bold" w:hAnsi="Arial Rounded MT Bold"/>
+          <w:u w:val="single"/>
+        </w:rPr>
+        <w:t xml:space="preserve">Ingreso al a base de datos a través de la consola de Docker o en su defecto </w:t>
+      </w:r>
+      <w:proofErr w:type="spellStart"/>
+      <w:r>
+        <w:rPr>
+          <w:rFonts w:ascii="Arial Rounded MT Bold" w:hAnsi="Arial Rounded MT Bold"/>
+          <w:u w:val="single"/>
+        </w:rPr>
+        <w:t>poweeshelltablas</w:t>
+      </w:r>
+      <w:bookmarkEnd w:id="12"/>
+      <w:proofErr w:type="spellEnd"/>
+    </w:p>
+    <w:p>
+      <w:pPr>
+        <w:spacing w:before="40" w:after="40"/>
+        <w:rPr>
+          <w:rFonts w:ascii="Courier New" w:eastAsia="Courier New" w:hAnsi="Courier New" w:cs="Courier New"/>
+          <w:color w:val="333333"/>
+          <w:sz w:val="20"/>
+          <w:szCs w:val="20"/>
+          <w:u w:val="single"/>
+          <w:lang w:val="en-US"/>
+        </w:rPr>
+      </w:pPr>
+      <w:r>
+        <w:rPr>
+          <w:rFonts w:ascii="Courier New" w:eastAsia="Courier New" w:hAnsi="Courier New" w:cs="Courier New"/>
+          <w:color w:val="333333"/>
+          <w:sz w:val="20"/>
+          <w:szCs w:val="20"/>
+          <w:u w:val="single"/>
+          <w:lang w:val="en-US"/>
+        </w:rPr>
+        <w:t xml:space="preserve">docker exec -it </w:t>
+      </w:r>
+      <w:proofErr w:type="spellStart"/>
+      <w:r>
+        <w:rPr>
+          <w:rFonts w:ascii="Courier New" w:eastAsia="Courier New" w:hAnsi="Courier New" w:cs="Courier New"/>
+          <w:color w:val="333333"/>
+          <w:sz w:val="20"/>
+          <w:szCs w:val="20"/>
+          <w:u w:val="single"/>
+          <w:lang w:val="en-US"/>
+        </w:rPr>
+        <w:t>postgres</w:t>
+      </w:r>
+      <w:proofErr w:type="spellEnd"/>
+      <w:r>
+        <w:rPr>
+          <w:rFonts w:ascii="Courier New" w:eastAsia="Courier New" w:hAnsi="Courier New" w:cs="Courier New"/>
+          <w:color w:val="333333"/>
+          <w:sz w:val="20"/>
+          <w:szCs w:val="20"/>
+          <w:u w:val="single"/>
+          <w:lang w:val="en-US"/>
+        </w:rPr>
+        <w:t xml:space="preserve"> </w:t>
+      </w:r>
+      <w:proofErr w:type="spellStart"/>
+      <w:r>
+        <w:rPr>
+          <w:rFonts w:ascii="Courier New" w:eastAsia="Courier New" w:hAnsi="Courier New" w:cs="Courier New"/>
+          <w:color w:val="333333"/>
+          <w:sz w:val="20"/>
+          <w:szCs w:val="20"/>
+          <w:u w:val="single"/>
+          <w:lang w:val="en-US"/>
+        </w:rPr>
+        <w:t>psql</w:t>
+      </w:r>
+      <w:proofErr w:type="spellEnd"/>
+      <w:r>
+        <w:rPr>
+          <w:rFonts w:ascii="Courier New" w:eastAsia="Courier New" w:hAnsi="Courier New" w:cs="Courier New"/>
+          <w:color w:val="333333"/>
+          <w:sz w:val="20"/>
+          <w:szCs w:val="20"/>
+          <w:u w:val="single"/>
+          <w:lang w:val="en-US"/>
+        </w:rPr>
+        <w:t xml:space="preserve"> -U n8n -d </w:t>
+      </w:r>
+      <w:proofErr w:type="spellStart"/>
+      <w:r>
+        <w:rPr>
+          <w:rFonts w:ascii="Courier New" w:eastAsia="Courier New" w:hAnsi="Courier New" w:cs="Courier New"/>
+          <w:color w:val="333333"/>
+          <w:sz w:val="20"/>
+          <w:szCs w:val="20"/>
+          <w:u w:val="single"/>
+          <w:lang w:val="en-US"/>
+        </w:rPr>
+        <w:t>logs_db</w:t>
+      </w:r>
+      <w:proofErr w:type="spellEnd"/>
     </w:p>
     <w:p>
       <w:pPr>
@@ -5344,6 +5690,7 @@
           <w:rFonts w:asciiTheme="minorHAnsi" w:hAnsiTheme="minorHAnsi" w:cstheme="minorHAnsi"/>
           <w:sz w:val="24"/>
           <w:szCs w:val="24"/>
+          <w:u w:val="single"/>
           <w:lang w:val="en-US"/>
         </w:rPr>
       </w:pPr>
@@ -5353,16 +5700,134 @@
         <w:pStyle w:val="Ttulo2"/>
         <w:rPr>
           <w:rFonts w:ascii="Arial Rounded MT Bold" w:hAnsi="Arial Rounded MT Bold"/>
-        </w:rPr>
-      </w:pPr>
-      <w:bookmarkStart w:id="12" w:name="_Toc226313560"/>
+          <w:u w:val="single"/>
+        </w:rPr>
+      </w:pPr>
+      <w:bookmarkStart w:id="13" w:name="_Toc226547276"/>
       <w:r>
         <w:rPr>
           <w:rFonts w:ascii="Arial Rounded MT Bold" w:hAnsi="Arial Rounded MT Bold"/>
+          <w:u w:val="single"/>
+        </w:rPr>
+        <w:t>ver tablas</w:t>
+      </w:r>
+      <w:bookmarkEnd w:id="13"/>
+    </w:p>
+    <w:p>
+      <w:pPr>
+        <w:spacing w:before="40" w:after="40"/>
+        <w:rPr>
+          <w:rFonts w:ascii="Courier New" w:eastAsia="Courier New" w:hAnsi="Courier New" w:cs="Courier New"/>
+          <w:color w:val="333333"/>
+          <w:sz w:val="20"/>
+          <w:szCs w:val="20"/>
+          <w:u w:val="single"/>
+          <w:lang w:val="en-US"/>
+        </w:rPr>
+      </w:pPr>
+      <w:r>
+        <w:rPr>
+          <w:rFonts w:ascii="Courier New" w:eastAsia="Courier New" w:hAnsi="Courier New" w:cs="Courier New"/>
+          <w:color w:val="333333"/>
+          <w:sz w:val="20"/>
+          <w:szCs w:val="20"/>
+          <w:u w:val="single"/>
+          <w:lang w:val="en-US"/>
+        </w:rPr>
+        <w:t>\</w:t>
+      </w:r>
+      <w:proofErr w:type="gramStart"/>
+      <w:r>
+        <w:rPr>
+          <w:rFonts w:ascii="Courier New" w:eastAsia="Courier New" w:hAnsi="Courier New" w:cs="Courier New"/>
+          <w:color w:val="333333"/>
+          <w:sz w:val="20"/>
+          <w:szCs w:val="20"/>
+          <w:u w:val="single"/>
+          <w:lang w:val="en-US"/>
+        </w:rPr>
+        <w:t>dt</w:t>
+      </w:r>
+      <w:proofErr w:type="gramEnd"/>
+    </w:p>
+    <w:p>
+      <w:pPr>
+        <w:pStyle w:val="Prrafodelista"/>
+        <w:spacing w:before="40" w:after="40"/>
+        <w:ind w:left="720"/>
+        <w:rPr>
+          <w:rFonts w:cstheme="minorHAnsi"/>
+          <w:sz w:val="24"/>
+          <w:szCs w:val="24"/>
+          <w:u w:val="single"/>
+        </w:rPr>
+      </w:pPr>
+    </w:p>
+    <w:p>
+      <w:pPr>
+        <w:pStyle w:val="Ttulo2"/>
+        <w:rPr>
+          <w:rFonts w:ascii="Arial Rounded MT Bold" w:hAnsi="Arial Rounded MT Bold"/>
+          <w:u w:val="single"/>
+        </w:rPr>
+      </w:pPr>
+      <w:bookmarkStart w:id="14" w:name="_Toc226547277"/>
+      <w:r>
+        <w:rPr>
+          <w:rFonts w:ascii="Arial Rounded MT Bold" w:hAnsi="Arial Rounded MT Bold"/>
+          <w:u w:val="single"/>
         </w:rPr>
         <w:t>Crear la tabla de logs en PostgreSQL</w:t>
       </w:r>
-      <w:bookmarkEnd w:id="12"/>
+      <w:bookmarkEnd w:id="14"/>
+    </w:p>
+    <w:p>
+      <w:pPr>
+        <w:spacing w:before="40" w:after="40"/>
+        <w:rPr>
+          <w:rFonts w:ascii="Arial" w:hAnsi="Arial" w:cstheme="minorHAnsi"/>
+          <w:sz w:val="24"/>
+          <w:szCs w:val="24"/>
+          <w:u w:val="single"/>
+        </w:rPr>
+      </w:pPr>
+      <w:r>
+        <w:rPr>
+          <w:rFonts w:ascii="Courier New" w:eastAsia="Courier New" w:hAnsi="Courier New" w:cs="Courier New"/>
+          <w:color w:val="333333"/>
+          <w:sz w:val="20"/>
+          <w:szCs w:val="20"/>
+          <w:u w:val="single"/>
+          <w:lang w:val="en-US"/>
+        </w:rPr>
+        <w:t>SELECT * FROM logs;</w:t>
+      </w:r>
+    </w:p>
+    <w:p>
+      <w:pPr>
+        <w:pStyle w:val="Ttulo2"/>
+        <w:rPr>
+          <w:rFonts w:ascii="Arial Rounded MT Bold" w:hAnsi="Arial Rounded MT Bold"/>
+          <w:u w:val="single"/>
+          <w:lang w:val="en-US"/>
+        </w:rPr>
+      </w:pPr>
+    </w:p>
+    <w:p>
+      <w:pPr>
+        <w:pStyle w:val="Ttulo2"/>
+        <w:rPr>
+          <w:rFonts w:ascii="Arial Rounded MT Bold" w:hAnsi="Arial Rounded MT Bold"/>
+        </w:rPr>
+      </w:pPr>
+      <w:bookmarkStart w:id="15" w:name="_Toc226547278"/>
+      <w:r>
+        <w:rPr>
+          <w:rFonts w:ascii="Arial Rounded MT Bold" w:hAnsi="Arial Rounded MT Bold"/>
+        </w:rPr>
+        <w:t>Crear la tabla de logs en PostgreSQL</w:t>
+      </w:r>
+      <w:bookmarkEnd w:id="15"/>
     </w:p>
     <w:p>
       <w:pPr>
@@ -5546,14 +6011,15 @@
           <w:rFonts w:ascii="Arial Rounded MT Bold" w:hAnsi="Arial Rounded MT Bold"/>
         </w:rPr>
       </w:pPr>
-      <w:bookmarkStart w:id="13" w:name="_Toc226313561"/>
+      <w:bookmarkStart w:id="16" w:name="_Toc226547279"/>
       <w:r>
         <w:rPr>
           <w:rFonts w:ascii="Arial Rounded MT Bold" w:hAnsi="Arial Rounded MT Bold"/>
         </w:rPr>
+        <w:lastRenderedPageBreak/>
         <w:t>Importar el flujo en n8n</w:t>
       </w:r>
-      <w:bookmarkEnd w:id="13"/>
+      <w:bookmarkEnd w:id="16"/>
     </w:p>
     <w:p>
       <w:pPr>
@@ -5797,14 +6263,14 @@
           <w:rFonts w:ascii="Arial Rounded MT Bold" w:hAnsi="Arial Rounded MT Bold"/>
         </w:rPr>
       </w:pPr>
-      <w:bookmarkStart w:id="14" w:name="_Toc226313562"/>
+      <w:bookmarkStart w:id="17" w:name="_Toc226547280"/>
       <w:r>
         <w:rPr>
           <w:rFonts w:ascii="Arial Rounded MT Bold" w:hAnsi="Arial Rounded MT Bold"/>
         </w:rPr>
         <w:t>Formato del correo disparador</w:t>
       </w:r>
-      <w:bookmarkEnd w:id="14"/>
+      <w:bookmarkEnd w:id="17"/>
     </w:p>
     <w:p>
       <w:pPr>
@@ -5902,7 +6368,6 @@
           <w:sz w:val="24"/>
           <w:szCs w:val="24"/>
         </w:rPr>
-        <w:lastRenderedPageBreak/>
         <w:t xml:space="preserve">El </w:t>
       </w:r>
       <w:proofErr w:type="spellStart"/>
@@ -5963,14 +6428,14 @@
           <w:rFonts w:ascii="Arial Rounded MT Bold" w:eastAsia="Arial" w:hAnsi="Arial Rounded MT Bold"/>
         </w:rPr>
       </w:pPr>
-      <w:bookmarkStart w:id="15" w:name="_Toc226313563"/>
+      <w:bookmarkStart w:id="18" w:name="_Toc226547281"/>
       <w:r>
         <w:rPr>
           <w:rFonts w:ascii="Arial Rounded MT Bold" w:eastAsia="Arial" w:hAnsi="Arial Rounded MT Bold"/>
         </w:rPr>
         <w:t>Variables de configuración</w:t>
       </w:r>
-      <w:bookmarkEnd w:id="15"/>
+      <w:bookmarkEnd w:id="18"/>
     </w:p>
     <w:tbl>
       <w:tblPr>
@@ -6802,14 +7267,14 @@
           <w:rFonts w:ascii="Arial Rounded MT Bold" w:hAnsi="Arial Rounded MT Bold"/>
         </w:rPr>
       </w:pPr>
-      <w:bookmarkStart w:id="16" w:name="_Toc226313564"/>
+      <w:bookmarkStart w:id="19" w:name="_Toc226547282"/>
       <w:r>
         <w:rPr>
           <w:rFonts w:ascii="Arial Rounded MT Bold" w:hAnsi="Arial Rounded MT Bold"/>
         </w:rPr>
         <w:t>Decisiones técnicas clave</w:t>
       </w:r>
-      <w:bookmarkEnd w:id="16"/>
+      <w:bookmarkEnd w:id="19"/>
     </w:p>
     <w:p>
       <w:pPr>
@@ -6825,14 +7290,14 @@
           <w:rFonts w:ascii="Arial Rounded MT Bold" w:hAnsi="Arial Rounded MT Bold"/>
         </w:rPr>
       </w:pPr>
-      <w:bookmarkStart w:id="17" w:name="_Toc226313565"/>
+      <w:bookmarkStart w:id="20" w:name="_Toc226547283"/>
       <w:r>
         <w:rPr>
           <w:rFonts w:ascii="Arial Rounded MT Bold" w:hAnsi="Arial Rounded MT Bold"/>
         </w:rPr>
         <w:t>Estrategia para identificar el sexto resultado</w:t>
       </w:r>
-      <w:bookmarkEnd w:id="17"/>
+      <w:bookmarkEnd w:id="20"/>
     </w:p>
     <w:p>
       <w:pPr>
@@ -6952,15 +7417,14 @@
           <w:rFonts w:ascii="Arial Rounded MT Bold" w:hAnsi="Arial Rounded MT Bold"/>
         </w:rPr>
       </w:pPr>
-      <w:bookmarkStart w:id="18" w:name="_Toc226313566"/>
+      <w:bookmarkStart w:id="21" w:name="_Toc226547284"/>
       <w:r>
         <w:rPr>
           <w:rFonts w:ascii="Arial Rounded MT Bold" w:hAnsi="Arial Rounded MT Bold"/>
         </w:rPr>
-        <w:lastRenderedPageBreak/>
         <w:t>Cómo se extrae el nombre del correo</w:t>
       </w:r>
-      <w:bookmarkEnd w:id="18"/>
+      <w:bookmarkEnd w:id="21"/>
     </w:p>
     <w:p>
       <w:pPr>
@@ -7113,14 +7577,14 @@
           <w:rFonts w:ascii="Arial Rounded MT Bold" w:hAnsi="Arial Rounded MT Bold"/>
         </w:rPr>
       </w:pPr>
-      <w:bookmarkStart w:id="19" w:name="_Toc226313567"/>
+      <w:bookmarkStart w:id="22" w:name="_Toc226547285"/>
       <w:r>
         <w:rPr>
           <w:rFonts w:ascii="Arial Rounded MT Bold" w:hAnsi="Arial Rounded MT Bold"/>
         </w:rPr>
         <w:t>Cómo se maneja la descarga del archivo</w:t>
       </w:r>
-      <w:bookmarkEnd w:id="19"/>
+      <w:bookmarkEnd w:id="22"/>
     </w:p>
     <w:p>
       <w:pPr>
@@ -7219,7 +7683,7 @@
           <w:rFonts w:ascii="Arial Rounded MT Bold" w:eastAsia="Arial" w:hAnsi="Arial Rounded MT Bold"/>
         </w:rPr>
       </w:pPr>
-      <w:bookmarkStart w:id="20" w:name="_Toc226313568"/>
+      <w:bookmarkStart w:id="23" w:name="_Toc226547286"/>
       <w:r>
         <w:rPr>
           <w:rFonts w:ascii="Arial Rounded MT Bold" w:eastAsia="Arial" w:hAnsi="Arial Rounded MT Bold"/>
@@ -7252,7 +7716,7 @@
         </w:rPr>
         <w:t>)</w:t>
       </w:r>
-      <w:bookmarkEnd w:id="20"/>
+      <w:bookmarkEnd w:id="23"/>
     </w:p>
     <w:p>
       <w:pPr>
@@ -7393,14 +7857,14 @@
           <w:rFonts w:ascii="Arial Rounded MT Bold" w:hAnsi="Arial Rounded MT Bold"/>
         </w:rPr>
       </w:pPr>
-      <w:bookmarkStart w:id="21" w:name="_Toc226313569"/>
+      <w:bookmarkStart w:id="24" w:name="_Toc226547287"/>
       <w:r>
         <w:rPr>
           <w:rFonts w:ascii="Arial Rounded MT Bold" w:hAnsi="Arial Rounded MT Bold"/>
         </w:rPr>
         <w:t>Arquitectura de logs con PostgreSQL</w:t>
       </w:r>
-      <w:bookmarkEnd w:id="21"/>
+      <w:bookmarkEnd w:id="24"/>
     </w:p>
     <w:p>
       <w:pPr>
@@ -7446,7 +7910,15 @@
           <w:sz w:val="24"/>
           <w:szCs w:val="24"/>
         </w:rPr>
-        <w:t xml:space="preserve">). Esto ofrece ventajas adicionales: consultas SQL, filtros por fecha y exportación con un solo clic vía export_logs.bat. El flujo registra tres puntos de control: inicio, resultado de </w:t>
+        <w:t xml:space="preserve">). Esto ofrece ventajas adicionales: consultas SQL, filtros por fecha </w:t>
+      </w:r>
+      <w:r>
+        <w:rPr>
+          <w:sz w:val="24"/>
+          <w:szCs w:val="24"/>
+        </w:rPr>
+        <w:lastRenderedPageBreak/>
+        <w:t xml:space="preserve">y exportación con un solo clic vía export_logs.bat. El flujo registra tres puntos de control: inicio, resultado de </w:t>
       </w:r>
       <w:proofErr w:type="spellStart"/>
       <w:r>
@@ -7472,14 +7944,14 @@
           <w:rFonts w:ascii="Arial Rounded MT Bold" w:hAnsi="Arial Rounded MT Bold"/>
         </w:rPr>
       </w:pPr>
-      <w:bookmarkStart w:id="22" w:name="_Toc226313570"/>
+      <w:bookmarkStart w:id="25" w:name="_Toc226547288"/>
       <w:r>
         <w:rPr>
           <w:rFonts w:ascii="Arial Rounded MT Bold" w:hAnsi="Arial Rounded MT Bold"/>
         </w:rPr>
         <w:t>Manejo de errores</w:t>
       </w:r>
-      <w:bookmarkEnd w:id="22"/>
+      <w:bookmarkEnd w:id="25"/>
     </w:p>
     <w:tbl>
       <w:tblPr>
@@ -7934,14 +8406,14 @@
           <w:rFonts w:ascii="Arial Rounded MT Bold" w:hAnsi="Arial Rounded MT Bold"/>
         </w:rPr>
       </w:pPr>
-      <w:bookmarkStart w:id="23" w:name="_Toc226313571"/>
+      <w:bookmarkStart w:id="26" w:name="_Toc226547289"/>
       <w:r>
         <w:rPr>
           <w:rFonts w:ascii="Arial Rounded MT Bold" w:hAnsi="Arial Rounded MT Bold"/>
         </w:rPr>
         <w:t>Entregables del repositorio</w:t>
       </w:r>
-      <w:bookmarkEnd w:id="23"/>
+      <w:bookmarkEnd w:id="26"/>
     </w:p>
     <w:p>
       <w:pPr>
@@ -9282,7 +9754,7 @@
   <w:style w:type="paragraph" w:default="1" w:styleId="Normal">
     <w:name w:val="Normal"/>
     <w:qFormat/>
-    <w:rsid w:val="00E2098B"/>
+    <w:rsid w:val="00CB1E72"/>
   </w:style>
   <w:style w:type="paragraph" w:styleId="Ttulo1">
     <w:name w:val="heading 1"/>

</xml_diff>